<commit_message>
v17 second pass: document sync to F-026, tests re-included, audit answered
MS/SI/AR synced to the -0.50 family (global 3.0/3.1, regional yr-10 reordered
with FSU top, SOC 2.14/2.09, pulse 0.01%, prices 6.7% global); the stale ~55%
NUE claim corrected to ~8% at both sites; typos fixed; Hormuz wording moved to
the verified one-fifth-of-seaborne figure; Table S4 cells and Figure S6
annotations synced three ways; all regenerated figures re-embedded; the C-001
year-10 conditionality stated. Cross-document and parameter-consistency tests
rewritten for the in-tree v17 set and re-included: the gate is 17 suites,
exit 0, from a clean checkout. Release audit rewritten.

Co-Authored-By: Claude <noreply@anthropic.com>
Claude-Session: https://claude.ai/code/session_01CMwKCAyMmcwHrmJBEgXAZp
</commit_message>
<xml_diff>
--- a/resumbission/v17/Author_Response_ERFS-100341_v17.docx
+++ b/resumbission/v17/Author_Response_ERFS-100341_v17.docx
@@ -1639,12 +1639,22 @@
           <w:rFonts w:ascii="Aptos" w:hAnsi="Aptos"/>
         </w:rPr>
       </w:pPr>
-      <w:r>
-        <w:rPr>
-          <w:rFonts w:ascii="Aptos" w:hAnsi="Aptos"/>
-        </w:rPr>
-        <w:t>Replace “~5 percentage points” with a range: replaced with “2.6–4.6 percentage points.”</w:t>
-      </w:r>
+      <w:del w:id="9003" w:author="Matthew Wallenstein" w:date="2026-08-29T12:00:00Z">
+        <w:r>
+          <w:rPr>
+            <w:rFonts w:ascii="Aptos" w:hAnsi="Aptos"/>
+          </w:rPr>
+          <w:delText xml:space="preserve">Replace “~5 percentage points” with a range: replaced with “2.6–4.6 percentage points.”</w:delText>
+        </w:r>
+      </w:del>
+      <w:ins w:id="9004" w:author="Matthew Wallenstein" w:date="2026-08-29T12:00:00Z">
+        <w:r>
+          <w:rPr>
+            <w:rFonts w:ascii="Aptos" w:hAnsi="Aptos"/>
+          </w:rPr>
+          <w:t xml:space="preserve">Replace “~5 percentage points” with a range: replaced with “0.3–1.0 percentage points” under the audited nitrogen and crop prices and the corrected market clearing.</w:t>
+        </w:r>
+      </w:ins>
     </w:p>
     <w:p>
       <w:pPr>
@@ -2007,12 +2017,22 @@
           <w:rFonts w:ascii="Aptos" w:hAnsi="Aptos"/>
         </w:rPr>
       </w:pPr>
-      <w:r>
-        <w:rPr>
-          <w:rFonts w:ascii="Aptos" w:hAnsi="Aptos"/>
-        </w:rPr>
-        <w:t>Reference specific elasticity sensitivity (e.g., halving compresses year-10 loss ~25%): added with the explicit cross-reference to the revised Supplementary Figure S8.</w:t>
-      </w:r>
+      <w:del w:id="9001" w:author="Matthew Wallenstein" w:date="2026-08-29T12:00:00Z">
+        <w:r>
+          <w:rPr>
+            <w:rFonts w:ascii="Aptos" w:hAnsi="Aptos"/>
+          </w:rPr>
+          <w:delText xml:space="preserve">Reference specific elasticity sensitivity (e.g., halving compresses year-10 loss ~25%): added with the explicit cross-reference to the revised Supplementary Figure S8.</w:delText>
+        </w:r>
+      </w:del>
+      <w:ins w:id="9002" w:author="Matthew Wallenstein" w:date="2026-08-29T12:00:00Z">
+        <w:r>
+          <w:rPr>
+            <w:rFonts w:ascii="Aptos" w:hAnsi="Aptos"/>
+          </w:rPr>
+          <w:t xml:space="preserve">Reference specific elasticity sensitivity (halving all fertilizer-demand elasticities compresses global year-10 loss by ~50%): added with the explicit cross-reference to the revised Supplementary Figure S8.</w:t>
+        </w:r>
+      </w:ins>
     </w:p>
     <w:p>
       <w:pPr>
@@ -2347,12 +2367,22 @@
           <w:rFonts w:ascii="Aptos" w:hAnsi="Aptos"/>
         </w:rPr>
       </w:pPr>
-      <w:r>
-        <w:rPr>
-          <w:rFonts w:ascii="Aptos" w:hAnsi="Aptos"/>
-        </w:rPr>
-        <w:t>Figure S6 correction. The buffer-ratio panel annotation was corrected to Spearman ρ = +0.07 (Pearson R² = 0.03), consistent with the revised SI and Table 3; the previous graphic showed a mislabeled value.</w:t>
-      </w:r>
+      <w:del w:id="9005" w:author="Matthew Wallenstein" w:date="2026-08-29T12:00:00Z">
+        <w:r>
+          <w:rPr>
+            <w:rFonts w:ascii="Aptos" w:hAnsi="Aptos"/>
+          </w:rPr>
+          <w:delText xml:space="preserve">Figure S6 correction. The buffer-ratio panel annotation was corrected to Spearman ρ = +0.07 (Pearson R² = 0.03), consistent with the revised SI and Table 3; the previous graphic showed a mislabeled value.</w:delText>
+        </w:r>
+      </w:del>
+      <w:ins w:id="9006" w:author="Matthew Wallenstein" w:date="2026-08-29T12:00:00Z">
+        <w:r>
+          <w:rPr>
+            <w:rFonts w:ascii="Aptos" w:hAnsi="Aptos"/>
+          </w:rPr>
+          <w:t xml:space="preserve">Figure S6 correction. The buffer-ratio panel annotation reads Spearman ρ = +0.19 (Pearson R² = 0.10) in the final regenerated figure, consistent with the revised SI text and Supplementary Table 3; earlier drafts of the figure and letter carried mislabeled or stale values.</w:t>
+        </w:r>
+      </w:ins>
     </w:p>
     <w:p>
       <w:pPr>
@@ -2362,7 +2392,7 @@
       </w:pPr>
       <w:ins w:id="9004" w:author="Matthew Wallenstein" w:date="2026-08-29T12:00:00Z">
         <w:r>
-          <w:t xml:space="preserve">Market-clearing consistency. In the course of this revision we identified, and removed, an internal inconsistency in the economic component: the food price was solved against a log-linear (Cobb–Douglas) approximation of the production response, while reported production came from the nonlinear biophysical model, so the price cleared a production change that differed from the reported one by up to 1.5 percentage points in year 1 (about 0.2 percentage points in the chronic phase). The market-clearing price is now solved directly against the biophysical production response by numerical root-finding at every timestep, so the reported yields and the production changes implicit in the food-price responses are the same quantity by construction (clearing residual below 10⁻⁸ at every step). Adopting the consistent clearing left all yield trajectories unchanged to reported precision (largest movement 0.05 percentage points) and raised year-10 food-price responses by roughly 1–2 percentage points in most regions; all price figures in the manuscript and SI have been updated accordingly.</w:t>
+          <w:t xml:space="preserve">Market-clearing consistency. In the course of this revision we identified, and removed, an internal inconsistency in the economic component: the food price was solved against a log-linear (Cobb–Douglas) approximation of the production response, while reported production came from the nonlinear biophysical model, so the price cleared a production change that differed from the reported one by up to 1.5 percentage points in year 1 (about 0.2 percentage points in the chronic phase). The market-clearing price is now solved directly against the biophysical production response by numerical root-finding at every timestep, so the reported yields and the production changes implicit in the food-price responses are the same quantity by construction (clearing residual below 10⁻⁸ at every step). Adopting the consistent clearing left all yield trajectories unchanged to reported precision (largest movement 0.05 percentage points) and raised year-10 food-price responses by roughly 1–2 percentage points in most regions. Final verification also caught a configuration error in which the soil-N depletion elasticity documented in the SI (ε_F,N = −0.50, active in S3, SC1 and SC2) was set to zero in the code; the documented value is restored, and with it global year-10 loss is 3.0% and the one-year-pulse year-5 residual is 0.01%. The joint-prior Monte Carlo ensemble was regenerated under the corrected clearing and audited prices. All affected figures in the manuscript and SI have been updated accordingly.</w:t>
         </w:r>
       </w:ins>
     </w:p>

</xml_diff>

<commit_message>
F-027: second audit round closed; the release gate reads the released files
Clean files rebuilt by an XML-level accept preserving all 103 equations;
Tables 1/3 and Note 3 synced to regenerated artifacts; Figure S9 and the
ensemble prose restated from the stamped MC rerun (P(SSA worst)=0.0); Figure
S5, table 2 and the four-pool ratios withdrawn; s3_shock_calibration gets a
generator and the last --allow-unsourced flag is gone (C-050 restated to 19);
register basis genuinely v17-f026; checklist rebuilt; README climate 0.62;
cross-document gate expanded (corrected values required, twenty stale
fragments forbidden, ten figure hashes checked). verify: 17 suites, 32/32
nodes OK, exit 0.

Co-Authored-By: Claude <noreply@anthropic.com>
Claude-Session: https://claude.ai/code/session_01CMwKCAyMmcwHrmJBEgXAZp
</commit_message>
<xml_diff>
--- a/resumbission/v17/Author_Response_ERFS-100341_v17.docx
+++ b/resumbission/v17/Author_Response_ERFS-100341_v17.docx
@@ -660,7 +660,29 @@
         <w:rPr>
           <w:rFonts w:ascii="Aptos" w:hAnsi="Aptos"/>
         </w:rPr>
-        <w:t>Independent validation of the response shape. We validate the fertilizer-era response against the Broadbalk graduated-treatment series (Nil, N3PK, FYM), which anchors the SOM-mineralization-to-yield relationship for a temperate system (Supplementary Note 1). At the reviewer’s suggestion we have now added a tropical validation using the OFRA (Optimizing Fertilizer Recommendations in Africa) response-function database (6,184 georeferenced functions; Wortmann et al. 2017), extracting the 364 maize–nitrogen response functions for Sub-Saharan Africa. The modeled SSA response falls within the observed OFRA envelope, below the median but within the interquartile range: OFRA maize control (0 added N) median 3.55 t/ha (IQR 2.37–5.00) and ceiling median 4.48 t/ha (IQR 3.10–6.91), versus the model’s SSA ceiling y_max = 3.88 t/ha and degraded-soil control ≈ 1.3 t/ha. The modeled degraded regional-mean soil sits below the OFRA on-station control distribution, as expected, while the ceiling lies below the observed median but within the interquartile range. This directly addresses the reviewer’s SSA-validation concern; the new figure and full extraction are in the revised SI.</w:t>
+        <w:t xml:space="preserve">Independent validation of the response shape. We validate the fertilizer-era response against the Broadbalk graduated-treatment series (Nil, N3PK, FYM), which anchors the SOM-mineralization-to-yield relationship for a temperate system (Supplementary Note 1). At the reviewer’s suggestion we have now added a tropical validation using the OFRA (Optimizing Fertilizer Recommendations in Africa) response-function database (6,184 georeferenced functions; Wortmann et al. 2017), extracting the 364 maize–nitrogen response functions for Sub-Saharan Africa. The modeled SSA response falls within the observed OFRA envelope, below the median but within the interquartile range: OFRA maize control (0 added N) median 3.55 t/ha (IQR 2.37–5.00) and ceiling median 4.48 t/ha (IQR 3.10–6.91), </w:t>
+      </w:r>
+      <w:del w:id="9007" w:author="Matthew Wallenstein" w:date="2026-08-29T12:00:00Z">
+        <w:r>
+          <w:rPr>
+            <w:rFonts w:ascii="Aptos" w:hAnsi="Aptos"/>
+          </w:rPr>
+          <w:delText xml:space="preserve">versus the model’s SSA ceiling y_max = 3.88 t/ha and degraded-soil control ≈ 1.3 t/ha.</w:delText>
+        </w:r>
+      </w:del>
+      <w:ins w:id="9008" w:author="Matthew Wallenstein" w:date="2026-08-29T12:00:00Z">
+        <w:r>
+          <w:rPr>
+            <w:rFonts w:ascii="Aptos" w:hAnsi="Aptos"/>
+          </w:rPr>
+          <w:t xml:space="preserve">versus the model’s SSA ceiling y_max = 3.97 t/ha and degraded-soil control ≈ 1.3 t/ha.</w:t>
+        </w:r>
+      </w:ins>
+      <w:r>
+        <w:rPr>
+          <w:rFonts w:ascii="Aptos" w:hAnsi="Aptos"/>
+        </w:rPr>
+        <w:t xml:space="preserve"> The modeled degraded regional-mean soil sits below the OFRA on-station control distribution, as expected, while the ceiling lies below the observed median but within the interquartile range. This directly addresses the reviewer’s SSA-validation concern; the new figure and full extraction are in the revised SI.</w:t>
       </w:r>
     </w:p>
     <w:p>
@@ -816,7 +838,29 @@
         <w:rPr>
           <w:rFonts w:ascii="Aptos" w:hAnsi="Aptos"/>
         </w:rPr>
-        <w:t>To address this point directly, we replaced the representative climate profiles used in the submitted version with the ERA5-derived monthly normals described above and re-ran the coupled model. The results are essentially unchanged: year-10 regional yield losses shift by at most 0.54 percentage points and the ranking of regional vulnerability is preserved (Spearman ρ = 0.98). The ERA5-derived inputs are used directly in the Methods. Because this is an input-sensitivity comparison rather than a validation against observed outcomes, we do not present it as a manuscript figure; the full old-versus-new comparison is retained in the reproducibility archive as provenance. The climate inputs are thus both data-based and demonstrably not driving the conclusions.</w:t>
+        <w:t xml:space="preserve">To address this point directly, we replaced the representative climate profiles used in the submitted version with the ERA5-derived monthly normals described above and re-ran the coupled model. </w:t>
+      </w:r>
+      <w:del w:id="9001" w:author="Matthew Wallenstein" w:date="2026-08-29T12:00:00Z">
+        <w:r>
+          <w:rPr>
+            <w:rFonts w:ascii="Aptos" w:hAnsi="Aptos"/>
+          </w:rPr>
+          <w:delText xml:space="preserve">The results are essentially unchanged: year-10 regional yield losses shift by at most 0.54 percentage points and the ranking of regional vulnerability is preserved (Spearman ρ = 0.98).</w:delText>
+        </w:r>
+      </w:del>
+      <w:ins w:id="9002" w:author="Matthew Wallenstein" w:date="2026-08-29T12:00:00Z">
+        <w:r>
+          <w:rPr>
+            <w:rFonts w:ascii="Aptos" w:hAnsi="Aptos"/>
+          </w:rPr>
+          <w:t xml:space="preserve">The results are essentially unchanged: year-10 regional yield losses shift by at most 0.62 percentage points and the ranking of regional vulnerability is preserved (Spearman ρ = 0.98).</w:t>
+        </w:r>
+      </w:ins>
+      <w:r>
+        <w:rPr>
+          <w:rFonts w:ascii="Aptos" w:hAnsi="Aptos"/>
+        </w:rPr>
+        <w:t xml:space="preserve"> The ERA5-derived inputs are used directly in the Methods. Because this is an input-sensitivity comparison rather than a validation against observed outcomes, we do not present it as a manuscript figure; the full old-versus-new comparison is retained in the reproducibility archive as provenance. The climate inputs are thus both data-based and demonstrably not driving the conclusions.</w:t>
       </w:r>
     </w:p>
     <w:p>
@@ -1945,10 +1989,37 @@
         <w:rPr>
           <w:rFonts w:ascii="Aptos" w:hAnsi="Aptos"/>
         </w:rPr>
-        <w:t xml:space="preserve">Quantify the “value of supply-side recovery”: the manuscript states the SC1–SC2 contrast as a ratio — a permanent physical constraint (SC1) produces roughly twice the year-30 yield loss of one that resolves over 20 years (SC2). We report it as a ratio rather than a single percentage-point figure to keep it consistent with the </w:t>
-        <w:lastRenderedPageBreak/>
-        <w:t>manuscript’s weighting; the underlying regional trajectories are in the deposited data.</w:t>
-      </w:r>
+        <w:t xml:space="preserve">Quantify the “value of supply-side recovery”: </w:t>
+      </w:r>
+      <w:del w:id="9005" w:author="Matthew Wallenstein" w:date="2026-08-29T12:00:00Z">
+        <w:r>
+          <w:rPr>
+            <w:rFonts w:ascii="Aptos" w:hAnsi="Aptos"/>
+          </w:rPr>
+          <w:delText xml:space="preserve">the manuscript states the SC1–SC2 contrast as a ratio — a permanent physical constraint (SC1) produces roughly twice the year-30 yield loss of one that resolves over 20 years (SC2). We report it as a ratio rather than a single percentage-point figure to keep it c</w:delText>
+        </w:r>
+      </w:del>
+      <w:ins w:id="9006" w:author="Matthew Wallenstein" w:date="2026-08-29T12:00:00Z">
+        <w:r>
+          <w:rPr>
+            <w:rFonts w:ascii="Aptos" w:hAnsi="Aptos"/>
+          </w:rPr>
+          <w:t xml:space="preserve">the manuscript now states the SC1–SC2 contrast as the two values rather than a ratio: a permanent physical constraint (SC1) leaves a 3.8% year-30 loss, while one that resolves over 20 years (SC2) essentially recovers (0.02%). A ratio is not meaningful against a near-zero denominator, so we state the values; the underlying regional trajectories are in the deposited data.</w:t>
+        </w:r>
+      </w:ins>
+      <w:del w:id="9001" w:author="Matthew Wallenstein" w:date="2026-08-29T12:00:00Z">
+        <w:r>
+          <w:rPr>
+            <w:rFonts w:ascii="Aptos" w:hAnsi="Aptos"/>
+          </w:rPr>
+          <w:delText xml:space="preserve">onsistent with the </w:delText>
+        </w:r>
+      </w:del>
+      <w:del w:id="9001" w:author="Matthew Wallenstein" w:date="2026-08-29T12:00:00Z">
+        <w:r>
+          <w:delText xml:space="preserve">manuscript’s weighting; the underlying regional trajectories are in the deposited data.</w:delText>
+        </w:r>
+      </w:del>
     </w:p>
     <w:p>
       <w:pPr>
@@ -2335,7 +2406,29 @@
         <w:rPr>
           <w:rFonts w:ascii="Aptos" w:hAnsi="Aptos"/>
         </w:rPr>
-        <w:t>Climate/soil-water provenance. The monthly climate inputs were re-derived from the ERA5 reanalysis (2001–2020 normals, Hargreaves PET) and the model re-run; headline results are unchanged (max Δ 0.54 pp; Spearman ρ = 0.98), with the ERA5 inputs now used directly in the Methods and the full old-versus-new comparison retained in the reproducibility archive as provenance.</w:t>
+        <w:t xml:space="preserve">Climate/soil-water provenance. The monthly climate inputs were re-derived from the ERA5 reanalysis (2001–2020 normals, Hargreaves PET) and the model re-run; </w:t>
+      </w:r>
+      <w:del w:id="9003" w:author="Matthew Wallenstein" w:date="2026-08-29T12:00:00Z">
+        <w:r>
+          <w:rPr>
+            <w:rFonts w:ascii="Aptos" w:hAnsi="Aptos"/>
+          </w:rPr>
+          <w:delText xml:space="preserve">headline results are unchanged (max Δ 0.54 pp; Spearman ρ = 0.98)</w:delText>
+        </w:r>
+      </w:del>
+      <w:ins w:id="9004" w:author="Matthew Wallenstein" w:date="2026-08-29T12:00:00Z">
+        <w:r>
+          <w:rPr>
+            <w:rFonts w:ascii="Aptos" w:hAnsi="Aptos"/>
+          </w:rPr>
+          <w:t xml:space="preserve">headline results are unchanged (max Δ 0.62 pp; Spearman ρ = 0.98)</w:t>
+        </w:r>
+      </w:ins>
+      <w:r>
+        <w:rPr>
+          <w:rFonts w:ascii="Aptos" w:hAnsi="Aptos"/>
+        </w:rPr>
+        <w:t xml:space="preserve">, with the ERA5 inputs now used directly in the Methods and the full old-versus-new comparison retained in the reproducibility archive as provenance.</w:t>
       </w:r>
     </w:p>
     <w:p>

</xml_diff>